<commit_message>
Ajustar redaccion a un tono claro y natural
</commit_message>
<xml_diff>
--- a/DOCUMENTACION_SERVICIOS_INVENTA.docx
+++ b/DOCUMENTACION_SERVICIOS_INVENTA.docx
@@ -169,12 +169,12 @@
     </w:p>
     <w:p>
       <w:r>
-        <w:t>Este documento presenta el diseño, la implementación y la documentación de los servicios web del sistema INVENTA. La solución mantiene las entidades desarrolladas en evidencias anteriores - clientes, productos, ventas y detalle de venta - y las expone mediante una API REST que intercambia información en formato JSON.</w:t>
+        <w:t>En esta evidencia se realizó el diseño y la programación de los servicios web del sistema INVENTA. Se tomaron como base los módulos de clientes, productos y ventas que se habían trabajado anteriormente, y se creó una API REST para consultar y enviar la información en formato JSON.</w:t>
       </w:r>
     </w:p>
     <w:p>
       <w:r>
-        <w:t>El alcance no se limita a operaciones básicas de consulta. La API protege la trazabilidad comercial, controla las existencias, calcula los valores de cada venta en el servidor y permite anular una operación reintegrando las unidades al inventario.</w:t>
+        <w:t>Además de consultar y registrar datos, la API controla las existencias disponibles, calcula el valor de cada venta y permite anular una venta devolviendo las unidades al inventario. Estas funciones se incluyeron porque hacen parte del funcionamiento de INVENTA.</w:t>
       </w:r>
     </w:p>
     <w:p>
@@ -4220,7 +4220,7 @@
     </w:p>
     <w:p>
       <w:r>
-        <w:t>El cliente no envía precio, subtotal, total ni estado. Estos valores se obtienen en el servidor a partir del catálogo, lo cual evita inconsistencias y mantiene una única fuente de verdad.</w:t>
+        <w:t>En la solicitud solo se envían el cliente, el producto y la cantidad. El servidor consulta el precio guardado y calcula el subtotal y el total. Así se evita que el valor de una venta sea modificado desde la solicitud.</w:t>
       </w:r>
     </w:p>
     <w:p>
@@ -5044,12 +5044,12 @@
     </w:p>
     <w:p>
       <w:r>
-        <w:t>La API desarrollada cubre el flujo comercial central de INVENTA y conserva coherencia con las entidades construidas en las evidencias anteriores. Las validaciones se aplican en el servidor, el inventario se modifica de forma controlada y la anulación mantiene la trazabilidad de la operación.</w:t>
+        <w:t>Con esta API fue posible implementar las funciones principales del sistema INVENTA. Se pueden administrar clientes, productos y ventas, además de controlar el inventario y mantener organizada la información del proyecto.</w:t>
       </w:r>
     </w:p>
     <w:p>
       <w:r>
-        <w:t>La documentación OpenAPI permite importar el contrato en Postman, mientras que las pruebas automáticas permiten repetir la verificación sin depender de una demostración manual.</w:t>
+        <w:t>También se dejó la documentación OpenAPI para importar los servicios en Postman y se crearon pruebas automáticas para comprobar que las funciones continúan trabajando correctamente.</w:t>
       </w:r>
     </w:p>
     <w:sectPr>

</xml_diff>

<commit_message>
Corregir referencia del historial y humanizar el documento
</commit_message>
<xml_diff>
--- a/DOCUMENTACION_SERVICIOS_INVENTA.docx
+++ b/DOCUMENTACION_SERVICIOS_INVENTA.docx
@@ -169,12 +169,12 @@
     </w:p>
     <w:p>
       <w:r>
-        <w:t>En esta evidencia se realizó el diseño y la programación de los servicios web del sistema INVENTA. Se tomaron como base los módulos de clientes, productos y ventas que se habían trabajado anteriormente, y se creó una API REST para consultar y enviar la información en formato JSON.</w:t>
+        <w:t>Para esta evidencia tomé como base los módulos de clientes, productos y ventas que ya se habían trabajado en INVENTA. A partir de ellos desarrollé una API REST que permite consultar, registrar y actualizar la información usando solicitudes HTTP y datos en formato JSON.</w:t>
       </w:r>
     </w:p>
     <w:p>
       <w:r>
-        <w:t>Además de consultar y registrar datos, la API controla las existencias disponibles, calcula el valor de cada venta y permite anular una venta devolviendo las unidades al inventario. Estas funciones se incluyeron porque hacen parte del funcionamiento de INVENTA.</w:t>
+        <w:t>También agregué las validaciones necesarias para controlar el stock, calcular el valor de las ventas y devolver las unidades al inventario cuando una venta se anula.</w:t>
       </w:r>
     </w:p>
     <w:p>
@@ -5044,12 +5044,12 @@
     </w:p>
     <w:p>
       <w:r>
-        <w:t>Con esta API fue posible implementar las funciones principales del sistema INVENTA. Se pueden administrar clientes, productos y ventas, además de controlar el inventario y mantener organizada la información del proyecto.</w:t>
+        <w:t>Al terminar el desarrollo pude comprobar que la API permite administrar los clientes, productos y ventas de INVENTA. También controla el inventario y evita registrar ventas cuando no hay suficientes unidades disponibles.</w:t>
       </w:r>
     </w:p>
     <w:p>
       <w:r>
-        <w:t>También se dejó la documentación OpenAPI para importar los servicios en Postman y se crearon pruebas automáticas para comprobar que las funciones continúan trabajando correctamente.</w:t>
+        <w:t>Finalmente preparé la documentación OpenAPI para utilizar los servicios en Postman y ejecuté pruebas automáticas. Las nueve pruebas terminaron correctamente.</w:t>
       </w:r>
     </w:p>
     <w:sectPr>

</xml_diff>